<commit_message>
Sanitized specific student and guide names from the report document
</commit_message>
<xml_diff>
--- a/report file/Project_Report.docx
+++ b/report file/Project_Report.docx
@@ -97,7 +97,7 @@
                 <w:b/>
                 <w:sz w:val="21"/>
               </w:rPr>
-              <w:t>DAMINI RAJORIA</w:t>
+              <w:t>[Student Name 1]</w:t>
             </w:r>
           </w:p>
         </w:tc>
@@ -115,7 +115,7 @@
                 <w:b/>
                 <w:sz w:val="21"/>
               </w:rPr>
-              <w:t>2200640130010</w:t>
+              <w:t>[Roll No 1]</w:t>
             </w:r>
           </w:p>
         </w:tc>
@@ -130,7 +130,7 @@
               <w:jc w:val="left"/>
             </w:pPr>
             <w:r>
-              <w:t>HARSHIT AGARWAL</w:t>
+              <w:t>[Student Name 2]</w:t>
             </w:r>
           </w:p>
         </w:tc>
@@ -143,7 +143,7 @@
               <w:jc w:val="left"/>
             </w:pPr>
             <w:r>
-              <w:t>2200640130017</w:t>
+              <w:t>[Roll No 2]</w:t>
             </w:r>
           </w:p>
         </w:tc>
@@ -158,7 +158,7 @@
               <w:jc w:val="left"/>
             </w:pPr>
             <w:r>
-              <w:t>RAVIKANT VASHISTHA</w:t>
+              <w:t>[Student Name 3]</w:t>
             </w:r>
           </w:p>
         </w:tc>
@@ -171,7 +171,7 @@
               <w:jc w:val="left"/>
             </w:pPr>
             <w:r>
-              <w:t>2200640130036</w:t>
+              <w:t>[Roll No 3]</w:t>
             </w:r>
           </w:p>
         </w:tc>
@@ -249,7 +249,7 @@
         <w:jc w:val="center"/>
       </w:pPr>
       <w:r>
-        <w:t>MRS. DEEPTI MITTAL</w:t>
+        <w:t>[Guide Name]</w:t>
         <w:br/>
         <w:t>Assistant Professor, Department of Information Technology</w:t>
       </w:r>
@@ -355,7 +355,7 @@
         <w:jc w:val="both"/>
       </w:pPr>
       <w:r>
-        <w:t>This is to certify that the project entitled "GESTURE-BASED AUTHENTICATION SYSTEM" has been carried out by DAMINI RAJORIA, HARSHIT AGARWAL, RAVIKANT VASHISTHA bearing Roll Numbers 2200640130010, 2200640130017, 2200640130036 in partial fulfillment of the requirements for the award of the Degree of Bachelor of Technology in Information Technology from Dr. A. P. J. Abdul Kalam Technical University, Lucknow, during the academic year 2025-2026.</w:t>
+        <w:t>This is to certify that the project entitled "GESTURE-BASED AUTHENTICATION SYSTEM" has been carried out by [Student Name 1], [Student Name 2], [Student Name 3] bearing Roll Numbers [Roll No 1], [Roll No 2], [Roll No 3] in partial fulfillment of the requirements for the award of the Degree of Bachelor of Technology in Information Technology from Dr. A. P. J. Abdul Kalam Technical University, Lucknow, during the academic year 2025-2026.</w:t>
       </w:r>
     </w:p>
     <w:p>
@@ -371,7 +371,7 @@
         <w:jc w:val="both"/>
       </w:pPr>
       <w:r>
-        <w:t>MRS. DEEPTI MITTAL</w:t>
+        <w:t>[Guide Name]</w:t>
         <w:br/>
         <w:t>Assistant Professor, Department of Information Technology</w:t>
         <w:br/>
@@ -386,7 +386,7 @@
         <w:rPr>
           <w:b/>
         </w:rPr>
-        <w:t>Mrs. Deepti Mittal</w:t>
+        <w:t>[Guide Name]</w:t>
       </w:r>
       <w:r>
         <w:t xml:space="preserve"> Head of Department &amp; Project Coordinator Department of Information Technology Hindustan College of Science &amp; Technology, Farah, Mathura</w:t>
@@ -419,7 +419,7 @@
         <w:jc w:val="both"/>
       </w:pPr>
       <w:r>
-        <w:t>First and foremost, we extend our deepest gratitude to our project guide, MRS. DEEPTI MITTAL, Assistant Professor, Department of Information Technology, Hindustan College of Science &amp; Technology, for invaluable guidance, continuous encouragement, technical insights, and unwavering support throughout the duration of this project. Constructive feedback and expert advice were instrumental in shaping this work.</w:t>
+        <w:t>First and foremost, we extend our deepest gratitude to our project guide, [Guide Name], Assistant Professor, Department of Information Technology, Hindustan College of Science &amp; Technology, for invaluable guidance, continuous encouragement, technical insights, and unwavering support throughout the duration of this project. Constructive feedback and expert advice were instrumental in shaping this work.</w:t>
       </w:r>
     </w:p>
     <w:p>
@@ -433,7 +433,7 @@
         <w:rPr>
           <w:b/>
         </w:rPr>
-        <w:t>Mrs. Deepti Mittal</w:t>
+        <w:t>[Guide Name]</w:t>
       </w:r>
       <w:r>
         <w:t>, Head of Department and Project Coordinator, Department of Information Technology, for providing us with the necessary resources, infrastructure, and moral support needed to complete this work. Her visionary leadership and academic guidance have been a constant source of inspiration.</w:t>
@@ -530,7 +530,7 @@
         <w:jc w:val="both"/>
       </w:pPr>
       <w:r>
-        <w:t>DAMINI RAJORIA, HARSHIT AGARWAL, RAVIKANT VASHISTHA</w:t>
+        <w:t>[Student Name 1], [Student Name 2], [Student Name 3]</w:t>
       </w:r>
     </w:p>
     <w:p>

</xml_diff>